<commit_message>
Drop product-scope figures that describe the product, not the work
"Nine-application", "built by a team of fourteen" and "five runtimes" all
came from the Ludwig dossier, which describes the whole suite. Saif
committed to six of those components and none to three of them, so the
numbers measure the product he worked on rather than anything he did.

They also invite exactly the wrong question. A reader who sees
"nine-application" hears a claim about scope and asks which nine - and the
honest answer requires walking part of it back. A CV line should survive
being asked about, not create the question.

Replaced with what is his: lead developer, features owned end to end from
data model and API integration through to the interface. Same for the
summary variants and the Ludwig project entry.

Co-Authored-By: Claude Opus 5 <noreply@anthropic.com>
Claude-Session: https://claude.ai/code/session_01QHYshPgJzJ5DDfZnK4J8sf
</commit_message>
<xml_diff>
--- a/profile/cv/generated/Saif_ur_Rehman_CV_frontend.docx
+++ b/profile/cv/generated/Saif_ur_Rehman_CV_frontend.docx
@@ -87,7 +87,7 @@
           <w:i w:val="0"/>
           <w:sz w:val="21"/>
         </w:rPr>
-        <w:t>Frontend Developer with 4+ years building large, long-lived application front ends. Lead developer on the practice dashboard of a medical practice-management suite - roughly 40 feature areas in Angular 19 and Ionic 8 - and on a patient booking wizard in Next.js 16 and React 19. Experienced in state management, offline-first synchronisation, internationalisation and shipping shared component libraries as versioned packages.</w:t>
+        <w:t>Frontend-focused Full Stack Developer with 4+ years building large, long-lived applications. Lead developer on a medical practice-management dashboard covering roughly 40 feature areas in Angular and Ionic, and on a patient booking wizard in Next.js and React. Experienced in state management, offline-first synchronisation, internationalisation and shipping shared component libraries as versioned packages.</w:t>
       </w:r>
     </w:p>
     <w:p>
@@ -351,7 +351,7 @@
         <w:rPr>
           <w:sz w:val="21"/>
         </w:rPr>
-        <w:t>•  Lead developer on Ludwig, a nine-application medical practice-management suite for physiotherapy and doctors' practices in Germany and Austria, owning features end to end from data model and API integration through to the interface.</w:t>
+        <w:t>•  Lead developer on Ludwig, a medical practice-management and patient-booking suite for physiotherapy and doctors' practices in Germany and Austria, owning features end to end from data model and API integration through to the interface.</w:t>
       </w:r>
     </w:p>
     <w:p>

</xml_diff>